<commit_message>
Add Trade Republic reversal as concrete proof in CX article
Fold in the April 2026 Trade Republic case: the neobroker scrapped
support chatbots for 1,000+ human agents (24/7 phone and chat in eight
languages) after automation-first support drew complaints and doubled
consumer grievances. Serves as live proof of Gartner's rehire prediction
and, via the eight-languages detail, bridges to the multilingual parity
payoff. Cross-links the TransPerfect analysis and adds Tech.eu source.
No em dashes.

Co-Authored-By: Claude Opus 4.8 <noreply@anthropic.com>
Claude-Session: https://claude.ai/code/session_01WdmaS8fb3WHmxD5MVo6UfL
</commit_message>
<xml_diff>
--- a/blog/CX-AI-Repricing-Contact-Center.docx
+++ b/blog/CX-AI-Repricing-Contact-Center.docx
@@ -67,7 +67,7 @@
         </w:rPr>
         <w:t xml:space="preserve">The most telling story in customer experience this year is not a product launch. It is a repricing. Markets are </w:t>
       </w:r>
-      <w:hyperlink w:history="1" r:id="rIdsuq70j22tfjcatj9bkqpi">
+      <w:hyperlink w:history="1" r:id="rIdaovv8mb5hof3nw6oql4ex">
         <w:r>
           <w:rPr>
             <w:rStyle w:val="Hyperlink"/>
@@ -84,7 +84,7 @@
         </w:rPr>
         <w:t xml:space="preserve">, dumping shares in outsourcing leaders like Teleperformance and Concentrix on the bet that automation will hollow out their core business. The logic is brutal and simple: the human cost floor for a customer interaction has sat at roughly $6 to $12 for years, while AI is pushing the marginal cost of a resolved ticket below $1.50. In a </w:t>
       </w:r>
-      <w:hyperlink w:history="1" r:id="rIdiepazy6p7wlzp0kvw_czi">
+      <w:hyperlink w:history="1" r:id="rIdqki_ejskaifsluqloyq_i">
         <w:r>
           <w:rPr>
             <w:rStyle w:val="Hyperlink"/>
@@ -113,7 +113,7 @@
         </w:rPr>
         <w:t xml:space="preserve">The forecasts behind the sell-off are not fringe. Gartner has projected that conversational AI would </w:t>
       </w:r>
-      <w:hyperlink w:history="1" r:id="rIdja_bulzax_vrgnebjywki">
+      <w:hyperlink w:history="1" r:id="rIdt2st7t1oe5i3urls90j-s">
         <w:r>
           <w:rPr>
             <w:rStyle w:val="Hyperlink"/>
@@ -130,7 +130,7 @@
         </w:rPr>
         <w:t xml:space="preserve">, noting that labor can account for up to 95% of contact-center costs. More recently, it predicted that </w:t>
       </w:r>
-      <w:hyperlink w:history="1" r:id="rIdqhjufr0rngpsuimt844e3">
+      <w:hyperlink w:history="1" r:id="rId9m66ecbc07qfbiuofbo4e">
         <w:r>
           <w:rPr>
             <w:rStyle w:val="Hyperlink"/>
@@ -147,7 +147,7 @@
         </w:rPr>
         <w:t xml:space="preserve">, cutting operational costs by around 30%. This is no longer scripted chatbots. Today's </w:t>
       </w:r>
-      <w:hyperlink w:history="1" r:id="rIdykrmdfj89xftkt3ud01j6">
+      <w:hyperlink w:history="1" r:id="rIdkmweincjyqdtzprznnehv">
         <w:r>
           <w:rPr>
             <w:rStyle w:val="Hyperlink"/>
@@ -191,7 +191,7 @@
         </w:rPr>
         <w:t xml:space="preserve">Here is where the headline gets more interesting than the stock chart. The savings are real, but the wholesale replacement of humans is running well ahead of what is actually happening. Gartner's own data shows the gap: </w:t>
       </w:r>
-      <w:hyperlink w:history="1" r:id="rIdpszbia8nae8vx_ojnjpui">
+      <w:hyperlink w:history="1" r:id="rIdbz5kenobve3ggkfx7vysz">
         <w:r>
           <w:rPr>
             <w:rStyle w:val="Hyperlink"/>
@@ -208,7 +208,7 @@
         </w:rPr>
         <w:t xml:space="preserve">, yet </w:t>
       </w:r>
-      <w:hyperlink w:history="1" r:id="rIdj95t2h-0nks4ile8e44nk">
+      <w:hyperlink w:history="1" r:id="rIdd8jswspfl6znw_i3ixvk1">
         <w:r>
           <w:rPr>
             <w:rStyle w:val="Hyperlink"/>
@@ -237,7 +237,7 @@
         </w:rPr>
         <w:t xml:space="preserve">Why the gap between the forecast and the floor? Because the cheap ticket and the good outcome are not the same product. Automating a password reset is easy. Handling a disputed charge, a fraud alert, a hardship case, or a confused first-time borrower is not, and getting it wrong in financial services is expensive in ways a per-interaction cost model does not capture. The industry's own emerging answer is not "bots instead of people" but a </w:t>
       </w:r>
-      <w:hyperlink w:history="1" r:id="rIdiebpt7abhttpwmsjfzj-s">
+      <w:hyperlink w:history="1" r:id="rId_firgi5zxesmsqbiih8-s">
         <w:r>
           <w:rPr>
             <w:rStyle w:val="Hyperlink"/>
@@ -253,6 +253,52 @@
           <w:szCs w:val="22"/>
         </w:rPr>
         <w:t xml:space="preserve">, with the handoffs invisible to the customer.</w:t>
+      </w:r>
+    </w:p>
+    <w:p>
+      <w:pPr>
+        <w:spacing w:after="160" w:line="288"/>
+      </w:pPr>
+      <w:r>
+        <w:rPr>
+          <w:sz w:val="22"/>
+          <w:szCs w:val="22"/>
+        </w:rPr>
+        <w:t xml:space="preserve">The clearest proof is not a forecast but a reversal. In April 2026, the neobroker Trade Republic </w:t>
+      </w:r>
+      <w:hyperlink w:history="1" r:id="rIdulqthdfdgqek0xy-dfhfm">
+        <w:r>
+          <w:rPr>
+            <w:rStyle w:val="Hyperlink"/>
+            <w:sz w:val="22"/>
+            <w:szCs w:val="22"/>
+          </w:rPr>
+          <w:t xml:space="preserve">scrapped its customer-service chatbots and hired more than 1,000 human agents</w:t>
+        </w:r>
+      </w:hyperlink>
+      <w:r>
+        <w:rPr>
+          <w:sz w:val="22"/>
+          <w:szCs w:val="22"/>
+        </w:rPr>
+        <w:t xml:space="preserve">, rolling out in-app phone and live chat around the clock in eight languages, after automation-first support drew complaints over long waits and poor access and grievances to consumer-protection agencies more than doubled in a year. A fintech valued at 12.5 billion euros concluded, in effect, that </w:t>
+      </w:r>
+      <w:hyperlink w:history="1" r:id="rIdasdmbn_whidrmrgos1zni">
+        <w:r>
+          <w:rPr>
+            <w:rStyle w:val="Hyperlink"/>
+            <w:sz w:val="22"/>
+            <w:szCs w:val="22"/>
+          </w:rPr>
+          <w:t xml:space="preserve">AI alone was not the answer</w:t>
+        </w:r>
+      </w:hyperlink>
+      <w:r>
+        <w:rPr>
+          <w:sz w:val="22"/>
+          <w:szCs w:val="22"/>
+        </w:rPr>
+        <w:t xml:space="preserve"> and reinvested in people. Note what it reinvested in: not just humans, but humans in eight languages.</w:t>
       </w:r>
     </w:p>
     <w:p>
@@ -281,7 +327,7 @@
         </w:rPr>
         <w:t xml:space="preserve">If AI collapses the cost of a basic answer to near zero, the value migrates to the things it cannot yet do cheaply and consistently: judgment, trust, and language. That last one is underrated. In 2026, </w:t>
       </w:r>
-      <w:hyperlink w:history="1" r:id="rIdte6zmmcgd5uh_pt-loeck">
+      <w:hyperlink w:history="1" r:id="rIdhto1jzon7ty2kn_yqxyz6">
         <w:r>
           <w:rPr>
             <w:rStyle w:val="Hyperlink"/>
@@ -368,7 +414,24 @@
         </w:rPr>
         <w:t xml:space="preserve"> </w:t>
       </w:r>
-      <w:hyperlink w:history="1" r:id="rIdc23rpdr4j_aw_uj-cap7a">
+      <w:hyperlink w:history="1" r:id="rIdqhcfvxmbuah0dsglpgcm-">
+        <w:r>
+          <w:rPr>
+            <w:rStyle w:val="Hyperlink"/>
+            <w:sz w:val="22"/>
+            <w:szCs w:val="22"/>
+          </w:rPr>
+          <w:t xml:space="preserve">Trade Republic's Customer Service Pivot Shows AI Alone Isn't the Answer</w:t>
+        </w:r>
+      </w:hyperlink>
+      <w:r>
+        <w:rPr>
+          <w:sz w:val="22"/>
+          <w:szCs w:val="22"/>
+        </w:rPr>
+        <w:t xml:space="preserve">, </w:t>
+      </w:r>
+      <w:hyperlink w:history="1" r:id="rIdtp2scmrkrlbio_gxaj-cy">
         <w:r>
           <w:rPr>
             <w:rStyle w:val="Hyperlink"/>
@@ -385,7 +448,7 @@
         </w:rPr>
         <w:t xml:space="preserve">, </w:t>
       </w:r>
-      <w:hyperlink w:history="1" r:id="rId-o63mdbwengwsdih22tgw">
+      <w:hyperlink w:history="1" r:id="rIdtu75ptuh_tqax3qjkofrs">
         <w:r>
           <w:rPr>
             <w:rStyle w:val="Hyperlink"/>
@@ -402,7 +465,7 @@
         </w:rPr>
         <w:t xml:space="preserve">, and </w:t>
       </w:r>
-      <w:hyperlink w:history="1" r:id="rIdpibq9efzcq0twfftmhseh">
+      <w:hyperlink w:history="1" r:id="rIdbksdjexv3xnnmd3nyutt5">
         <w:r>
           <w:rPr>
             <w:rStyle w:val="Hyperlink"/>
@@ -478,7 +541,7 @@
         </w:rPr>
         <w:t xml:space="preserve">Call center giants are being repriced out of existence before AI has finished the job (BPO stock sell-off; $6-12 to sub-$1.50 per interaction): </w:t>
       </w:r>
-      <w:hyperlink w:history="1" r:id="rIdc0peehokvs5cuaksmi6x3">
+      <w:hyperlink w:history="1" r:id="rIdzajn03o8iuknhn7fbqe6d">
         <w:r>
           <w:rPr>
             <w:rStyle w:val="Hyperlink"/>
@@ -505,7 +568,7 @@
         </w:rPr>
         <w:t xml:space="preserve">Global BPO market size and leaders (Teleperformance, Concentrix; $280B+ market): </w:t>
       </w:r>
-      <w:hyperlink w:history="1" r:id="rIdncw5xooo1dl-vhbmdcj4f">
+      <w:hyperlink w:history="1" r:id="rIdamtrmtolrggt0_ij6ghet">
         <w:r>
           <w:rPr>
             <w:rStyle w:val="Hyperlink"/>
@@ -548,7 +611,7 @@
         </w:rPr>
         <w:t xml:space="preserve"> (Aug 31, 2022): </w:t>
       </w:r>
-      <w:hyperlink w:history="1" r:id="rIdefiqbldhpogyi_t7ku4bb">
+      <w:hyperlink w:history="1" r:id="rIdpxqato0a99lckttes8ura">
         <w:r>
           <w:rPr>
             <w:rStyle w:val="Hyperlink"/>
@@ -591,7 +654,7 @@
         </w:rPr>
         <w:t xml:space="preserve"> (Mar 5, 2025): </w:t>
       </w:r>
-      <w:hyperlink w:history="1" r:id="rIdjl1rvyueaczifqb6dq6gu">
+      <w:hyperlink w:history="1" r:id="rIdlrsqdelduoodipke2hlcl">
         <w:r>
           <w:rPr>
             <w:rStyle w:val="Hyperlink"/>
@@ -634,7 +697,7 @@
         </w:rPr>
         <w:t xml:space="preserve"> (Feb 18, 2026): </w:t>
       </w:r>
-      <w:hyperlink w:history="1" r:id="rIdzpe8dt5cx0sumo-v5eshx">
+      <w:hyperlink w:history="1" r:id="rIdeqwwhmpfrt98hqhbhsoso">
         <w:r>
           <w:rPr>
             <w:rStyle w:val="Hyperlink"/>
@@ -677,7 +740,7 @@
         </w:rPr>
         <w:t xml:space="preserve"> (only ~20% cut staff; Feb 3, 2026): </w:t>
       </w:r>
-      <w:hyperlink w:history="1" r:id="rIdwjyuypns_hgpom_yplu3b">
+      <w:hyperlink w:history="1" r:id="rIdawjyqbgjndhput95knvkq">
         <w:r>
           <w:rPr>
             <w:rStyle w:val="Hyperlink"/>
@@ -704,7 +767,7 @@
         </w:rPr>
         <w:t xml:space="preserve">Agentic AI multi-step actions and the "Tandem Care" human-plus-AI model: </w:t>
       </w:r>
-      <w:hyperlink w:history="1" r:id="rIdouwsrdkyk9c6gcehhupxe">
+      <w:hyperlink w:history="1" r:id="rIdm9u94q170qgv7c2mgffal">
         <w:r>
           <w:rPr>
             <w:rStyle w:val="Hyperlink"/>
@@ -729,9 +792,53 @@
           <w:sz w:val="22"/>
           <w:szCs w:val="22"/>
         </w:rPr>
+        <w:t xml:space="preserve">Trade Republic scraps chatbots for 1,000+ human agents, 24/7 in eight languages (Apr 2026): </w:t>
+      </w:r>
+      <w:hyperlink w:history="1" r:id="rIdlps8vkhekuqr0jhlyi4he">
+        <w:r>
+          <w:rPr>
+            <w:rStyle w:val="Hyperlink"/>
+            <w:sz w:val="22"/>
+            <w:szCs w:val="22"/>
+          </w:rPr>
+          <w:t xml:space="preserve">Tech.eu</w:t>
+        </w:r>
+      </w:hyperlink>
+      <w:r>
+        <w:rPr>
+          <w:sz w:val="22"/>
+          <w:szCs w:val="22"/>
+        </w:rPr>
+        <w:t xml:space="preserve"> · TransPerfect analysis: </w:t>
+      </w:r>
+      <w:hyperlink w:history="1" r:id="rIdawvyi3shmprbp1xzv95r4">
+        <w:r>
+          <w:rPr>
+            <w:rStyle w:val="Hyperlink"/>
+            <w:sz w:val="22"/>
+            <w:szCs w:val="22"/>
+          </w:rPr>
+          <w:t xml:space="preserve">Trade Republic's Customer Service Pivot Shows AI Alone Isn't the Answer</w:t>
+        </w:r>
+      </w:hyperlink>
+    </w:p>
+    <w:p>
+      <w:pPr>
+        <w:pStyle w:val="ListParagraph"/>
+        <w:numPr>
+          <w:ilvl w:val="0"/>
+          <w:numId w:val="2"/>
+        </w:numPr>
+        <w:spacing w:after="100" w:line="288"/>
+      </w:pPr>
+      <w:r>
+        <w:rPr>
+          <w:sz w:val="22"/>
+          <w:szCs w:val="22"/>
+        </w:rPr>
         <w:t xml:space="preserve">The multilingual "parity gap" in AI support (accuracy, tone, guardrails, audit trail, language switching): </w:t>
       </w:r>
-      <w:hyperlink w:history="1" r:id="rIdkxxtcuttj32mh8p-j330h">
+      <w:hyperlink w:history="1" r:id="rIdqb2w2tqh1dydlmnpikshe">
         <w:r>
           <w:rPr>
             <w:rStyle w:val="Hyperlink"/>

</xml_diff>